<commit_message>
Ignore scraped house pages log
</commit_message>
<xml_diff>
--- a/Project Plan - Funda House Price Prediction.docx
+++ b/Project Plan - Funda House Price Prediction.docx
@@ -364,6 +364,16 @@
       <w:r>
         <w:t>Develop scraper with error handling, logging, retries, user-agent rotation</w:t>
       </w:r>
+      <w:r>
+        <w:t xml:space="preserve"> </w:t>
+      </w:r>
+      <w:r>
+        <w:rPr>
+          <w:b/>
+          <w:bCs/>
+        </w:rPr>
+        <w:t>✓</w:t>
+      </w:r>
     </w:p>
     <w:p>
       <w:pPr>
@@ -385,6 +395,16 @@
       </w:pPr>
       <w:r>
         <w:t>Explore and clean data: handle missing values, normalize formats, create features</w:t>
+      </w:r>
+      <w:r>
+        <w:t xml:space="preserve"> </w:t>
+      </w:r>
+      <w:r>
+        <w:rPr>
+          <w:b/>
+          <w:bCs/>
+        </w:rPr>
+        <w:t>✓</w:t>
       </w:r>
     </w:p>
     <w:p>
@@ -4804,6 +4824,7 @@
   <w:style w:type="character" w:default="1" w:styleId="DefaultParagraphFont">
     <w:name w:val="Default Paragraph Font"/>
     <w:uiPriority w:val="1"/>
+    <w:semiHidden/>
     <w:unhideWhenUsed/>
   </w:style>
   <w:style w:type="table" w:default="1" w:styleId="TableNormal">

</xml_diff>